<commit_message>
Refine and fix typos/spacing in BAO_CAO_DO_AN_LTM_NHOM11.docx
</commit_message>
<xml_diff>
--- a/BAO_CAO_DO_AN_LTM_NHOM11.docx
+++ b/BAO_CAO_DO_AN_LTM_NHOM11.docx
@@ -226,7 +226,7 @@
                 <w:szCs w:val="24"/>
                 <w:rtl w:val="0"/>
               </w:rPr>
-              <w:t xml:space="preserve">Giảng viên hướng  dẫn:</w:t>
+              <w:t>Giảng viên hướng dẫn:</w:t>
             </w:r>
             <w:r>
               <w:rPr>
@@ -995,7 +995,7 @@
         <w:rPr>
           <w:rtl w:val="0"/>
         </w:rPr>
-        <w:t>Các số liệu, sơ đồ, bảng biểu, thuật toán và mã nguồn trong đồ án đều trung thực và có thể kiểm chứng độc lập trên hệ thống thực tế. Nhóm cam kết tuân thủ quy định về liêm chính học thuật và phòng chống đạo văn của Trường Đại học Công nghệ TP.HCM. Các tài liệu tham khảo được trích dẫn rõ ràng theo tiêu chuẩn học thuật. Nếu có sự gian lận hoặc sao chép trái phép vượt quá 30%, nhóm xin chịu mọi hình thức kỷ luật theo quy chế của Nhà trường và Khoa Công nghệ Thông tin.</w:t>
+        <w:t>Các số liệu, sơ đồ, bảng biểu, thuật toán và mã nguồn trong đồ án đều trung thực và có thể được kiểm chứng độc lập trên hệ thống thực tế. Nhóm cam kết tuân thủ các quy định về liêm chính học thuật và phòng chống đạo văn của Trường Đại học Công nghệ TP.HCM. Các tài liệu tham khảo được trích dẫn rõ ràng theo tiêu chuẩn học thuật. Nếu có hành vi gian lận hoặc sao chép trái phép vượt quá 30%, nhóm xin chịu mọi hình thức kỷ luật theo quy chế của Nhà trường và Khoa Công nghệ Thông tin.</w:t>
       </w:r>
     </w:p>
     <w:p>
@@ -1099,7 +1099,7 @@
         <w:t>Nhóm xin gửi lời cảm ơn đến ThS. Nguyễn Lê Văn, giảng viên hướng dẫn học phần Lập trình mạng máy tính. Thầy đã truyền đạt kiến thức về mô hình mạng máy tính, giao thức truyền thông TCP/IP, kỹ thuật lập trình Socket đa luồng và theo sát tiến độ để nhóm hoàn thiện đề tài.</w:t>
         <w:br/>
         <w:br/>
-        <w:t>Nhóm cũng xin cảm ơn Ban Giám hiệu và Ban Chủ nhiệm Khoa Công nghệ Thông tin Trường Đại học Công nghệ TP.HCM (HUTECH) đã tạo điều kiện học tập với đầy đủ trang thiết bị phòng thực hành mạng và tài liệu tham khảo.</w:t>
+        <w:t>Nhóm cũng xin cảm ơn Ban Giám hiệu và Ban Chủ nhiệm Khoa Công nghệ Thông tin Trường Đại học Công nghệ TP.HCM (HUTECH) đã tạo điều kiện học tập với đầy đủ trang thiết bị thực hành và tài liệu tham khảo.</w:t>
         <w:br/>
         <w:br/>
         <w:t>Do kiến thức và kinh nghiệm thực tế còn hạn chế, đồ án khó tránh khỏi những thiếu sót. Nhóm rất mong nhận được những nhận xét, góp ý từ quý Thầy Cô để hoàn thiện hệ thống.</w:t>
@@ -3392,7 +3392,7 @@
         <w:rPr>
           <w:rtl w:val="0"/>
         </w:rPr>
-        <w:t>Các hệ thống máy chủ dữ liệu và mạng cục bộ (LAN) tại trường đại học đều cần giải pháp lưu trữ, chia sẻ dữ liệu có tốc độ cao và độ tin cậy ổn định. Giao thức truyền tệp FTP (File Transfer Protocol) được Tổ chức Tiêu chuẩn Internet (IETF) chuẩn hóa vào năm 1985 qua tài liệu RFC 959.</w:t>
+        <w:t>Các hệ thống máy chủ dữ liệu và mạng cục bộ (LAN) tại trường đại học đều cần giải pháp lưu trữ, chia sẻ dữ liệu có tốc độ cao và độ tin cậy ổn định. Giao thức truyền tệp FTP (File Transfer Protocol) được Tổ chức Tiêu chuẩn Internet (IETF) chuẩn hóa qua tài liệu RFC 959.</w:t>
       </w:r>
     </w:p>
     <w:p>
@@ -3406,7 +3406,7 @@
         <w:rPr>
           <w:rtl w:val="0"/>
         </w:rPr>
-        <w:t>Đặc điểm kỹ thuật chính của FTP là kiến trúc phân tách giữa kênh điều khiển (Control Channel) và kênh truyền dữ liệu (Data Channel). Kiến trúc này tách biệt các dòng lệnh văn bản khỏi luồng byte dữ liệu nhị phân, giúp việc quản lý phiên kết nối và giám sát tiến trình truyền tải diễn ra độc lập.</w:t>
+        <w:t>Đặc điểm kỹ thuật chính của FTP là kiến trúc phân tách giữa kênh điều khiển (Control Channel) và kênh dữ liệu (Data Channel). Kiến trúc này tách biệt các dòng lệnh văn bản khỏi luồng byte dữ liệu nhị phân, giúp việc quản lý phiên kết nối và giám sát tiến trình truyền tải diễn ra độc lập.</w:t>
       </w:r>
     </w:p>
     <w:p>
@@ -3504,7 +3504,7 @@
         <w:rPr>
           <w:rtl w:val="0"/>
         </w:rPr>
-        <w:t>Học phần Lập trình mạng máy tính thuộc chương trình đào tạo Kỹ sư/Cử nhân Công nghệ Thông tin tại Trường Đại học Công nghệ TP.HCM (HUTECH). Môn học cung cấp kiến thức về kiến trúc mạng tầng giao vận TCP/UDP, lập trình Socket, xử lý đa luồng và thiết kế giao thức ứng dụng. Việc tự xây dựng một hệ thống thực tế giúp sinh viên nắm bắt cách thức mô hình Client/Server phân tán vận hành ở cấp độ gói tin thay vì chỉ tiếp cận qua lý thuyết.</w:t>
+        <w:t>Học phần Lập trình mạng máy tính thuộc chương trình đào tạo Kỹ sư/Cử nhân Công nghệ Thông tin tại Trường Đại học Công nghệ TP.HCM (HUTECH). Môn học cung cấp kiến thức về kiến trúc mạng tầng giao vận TCP/UDP, lập trình Socket, xử lý đa luồng và thiết kế giao thức ứng dụng. Tự xây dựng một hệ thống thực tế cho phép sinh viên quan sát và tìm hiểu mô hình Client/Server vận hành ở cấp độ gói tin.</w:t>
       </w:r>
     </w:p>
     <w:p>
@@ -3541,7 +3541,7 @@
         <w:rPr>
           <w:rtl w:val="0"/>
         </w:rPr>
-        <w:t>Nhóm 11 chọn đề tài "Hệ thống FTP Server/Client cơ bản với hai kênh (Điều khiển và Dữ liệu)" để thực hành lập trình Socket trong Java. Hệ thống sử dụng một kết nối TCP cố định ở kênh điều khiển để xử lý giao dịch lệnh và phản hồi theo chuẩn RFC 959. Kênh dữ liệu được mở động theo cơ chế Passive Mode (PASV) nhằm truyền tải nội dung nhị phân. Quá trình xây dựng hệ thống giúp nhóm giải quyết trực tiếp các bài toán kỹ thuật trong lập trình mạng gồm quản lý đồng bộ luồng, cấp phát cổng động, truyền dữ liệu qua tường lửa (Firewall/NAT), chống tấn công vượt thư mục (Directory Traversal) và kiểm tra tính toàn vẹn dữ liệu.</w:t>
+        <w:t>Nhóm 11 chọn đề tài "Hệ thống FTP Server/Client cơ bản với hai kênh (Điều khiển và Dữ liệu)" để thực hành lập trình Socket trong Java. Hệ thống sử dụng một kết nối TCP cố định ở kênh điều khiển để xử lý giao dịch lệnh và phản hồi theo chuẩn RFC 959. Kênh dữ liệu được mở động theo cơ chế Passive Mode (PASV) giúp truyền tải nội dung nhị phân. Quá trình xây dựng hệ thống giúp nhóm giải quyết trực tiếp các bài toán kỹ thuật trong lập trình mạng gồm quản lý đồng bộ luồng, cấp phát cổng động, truyền dữ liệu qua tường lửa (Firewall/NAT), chống tấn công vượt thư mục (Directory Traversal) và kiểm tra tính toàn vẹn dữ liệu.</w:t>
       </w:r>
     </w:p>
     <w:p>
@@ -3717,7 +3717,7 @@
           <w:vertAlign w:val="baseline"/>
           <w:rtl w:val="0"/>
         </w:rPr>
-        <w:t>Lập trình FTP Server đa luồng (Multi-threaded) để tiếp nhận và phục vụ nhiều Client cùng lúc.</w:t>
+        <w:t>Lập trình FTP Server đa luồng (Multi-threaded) để tiếp nhận và phục vụ nhiều máy khách (Client) cùng lúc.</w:t>
       </w:r>
     </w:p>
     <w:p>
@@ -3840,7 +3840,7 @@
         <w:rPr>
           <w:rtl w:val="0"/>
         </w:rPr>
-        <w:t>• Đối tượng nghiên cứu là giao thức truyền tệp RFC 959, kiến trúc giao vận TCP/IP, thư viện Socket trong Java (java.net.Socket, java.net.ServerSocket), cơ chế đa luồng (Thread, ExecutorService), luồng bộ đệm I/O (Buffered Streams) và thư viện giao diện Java Swing.</w:t>
+        <w:t>• Đối tượng nghiên cứu là giao thức truyền tệp RFC 959, kiến trúc giao vận TCP/IP, thư viện Socket trong Java, cơ chế đa luồng, luồng bộ đệm I/O và thư viện giao diện Java Swing.</w:t>
         <w:br/>
         <w:t>• Phạm vi nghiên cứu là triển khai ứng dụng truyền tệp trong mạng nội bộ (LAN) hoặc giữa các máy tính kết nối qua mạng Wi-Fi cục bộ.</w:t>
       </w:r>
@@ -4652,7 +4652,7 @@
         <w:rPr>
           <w:rtl w:val="0"/>
         </w:rPr>
-        <w:t>Mô hình Client/Server (Khách/Chủ) phân chia tác vụ giữa bên cung cấp dịch vụ (Server) và bên yêu cầu dịch vụ (Client). Server luôn ở trạng thái lắng nghe thụ động (Passive Listening) trên một cổng mạng xác định. Khi một hoặc nhiều Client gửi yêu cầu kết nối chủ động (Active Connection), Server sẽ chấp nhận kết nối, khởi tạo phiên làm việc độc lập và duy trì tương tác cho đến khi Client gửi lệnh đóng phiên.</w:t>
+        <w:t>Mô hình Client/Server (Khách/Chủ) phân chia tác vụ giữa bên cung cấp dịch vụ (Server) và bên yêu cầu dịch vụ (Client). Server luôn ở trạng thái lắng nghe thụ động trên một cổng xác định. Khi một hoặc nhiều Client gửi yêu cầu kết nối chủ động (Active Connection), Server sẽ chấp nhận kết nối, khởi tạo phiên làm việc độc lập và duy trì tương tác cho đến khi Client gửi lệnh đóng phiên.</w:t>
       </w:r>
     </w:p>
     <w:p>
@@ -4689,7 +4689,7 @@
         <w:rPr>
           <w:rtl w:val="0"/>
         </w:rPr>
-        <w:t>Trong bộ giao thức Internet, TCP (Transmission Control Protocol) hoạt động tại tầng truyền vận (Transport Layer) và cung cấp dịch vụ truyền dữ liệu hướng kết nối (Connection-oriented). Với ứng dụng truyền tệp như FTP, dữ liệu không được phép thất lạc, đảo thứ tự hoặc sai lệch nội dung khi truyền dẫn. TCP đảm bảo yêu cầu này nhờ quy trình bắt tay ba bước (Three-way Handshake: SYN -&gt; SYN-ACK -&gt; ACK), đánh số thứ tự gói tin (Sequence Number), xác nhận gói tin (ACK Number), kiểm tra lỗi bằng Checksum và truyền lại gói tin khi mất dữ liệu (Retransmission).</w:t>
+        <w:t>Trong bộ giao thức Internet, TCP (Transmission Control Protocol) hoạt động tại tầng truyền vận (Transport Layer) và cung cấp dịch vụ truyền dữ liệu hướng kết nối (Connection-oriented). Với ứng dụng truyền tệp như FTP, dữ liệu không bị mất, đảo thứ tự hoặc sai lệch nội dung khi truyền dẫn. TCP đảm bảo yêu cầu này nhờ quy trình bắt tay ba bước (Three-way Handshake: SYN -&gt; SYN-ACK -&gt; ACK), đánh số thứ tự gói tin (Sequence Number), xác nhận gói tin (ACK Number), kiểm tra lỗi bằng Checksum và truyền lại gói tin khi mất dữ liệu (Retransmission).</w:t>
       </w:r>
     </w:p>
     <w:p>
@@ -4793,7 +4793,7 @@
           <w:vertAlign w:val="baseline"/>
           <w:rtl w:val="0"/>
         </w:rPr>
-        <w:t>Kênh điều khiển (Control Channel) được thiết lập đầu tiên khi Client kết nối tới cổng 2121 của Server. Kênh này duy trì xuyên suốt từ lúc đăng nhập đến khi ngắt kết nối, chỉ dùng để gửi chuỗi lệnh văn bản và nhận mã trạng thái phản hồi từ Server.</w:t>
+        <w:t>Kênh điều khiển (Control Channel) được thiết lập đầu tiên khi Client kết nối đến cổng 2121 của Server. Kênh này duy trì xuyên suốt từ lúc đăng nhập đến khi ngắt kết nối, chỉ dùng để gửi chuỗi lệnh văn bản và nhận mã trạng thái phản hồi từ Server.</w:t>
       </w:r>
     </w:p>
     <w:p>
@@ -4836,7 +4836,7 @@
           <w:vertAlign w:val="baseline"/>
           <w:rtl w:val="0"/>
         </w:rPr>
-        <w:t>Kênh dữ liệu (Data Channel) là một kết nối TCP độc lập, chỉ được mở khi có yêu cầu truyền dữ liệu thực tế như lấy danh sách tệp (LIST), tải tệp về (RETR) hoặc tải tệp lên (STOR). Ngay sau khi quá trình truyền dữ liệu hoàn tất, kết nối này sẽ đóng lại.</w:t>
+        <w:t>Kênh dữ liệu (Data Channel) là một kết nối TCP độc lập, chỉ được mở khi có yêu cầu truyền dữ liệu thực tế như lấy danh sách tệp (LIST), tải tệp về (RETR) hoặc tải tệp lên (STOR). Ngay sau khi quá trình truyền dữ liệu hoàn tất, kết nối đóng lại.</w:t>
       </w:r>
     </w:p>
     <w:p>
@@ -5666,7 +5666,7 @@
         <w:rPr>
           <w:rtl w:val="0"/>
         </w:rPr>
-        <w:t>Khi Client gửi lệnh PASV qua kênh điều khiển, Server cấp phát một cổng TCP đang trống trong dải từ 50000 đến 50100 và khởi tạo đối tượng ServerSocket mới. Sau đó, Server trả về mã trạng thái 227 kèm theo 6 số nguyên phân cách bằng dấu phẩy theo định dạng RFC 959:</w:t>
+        <w:t>Khi Client gửi lệnh PASV qua kênh điều khiển, Server cấp phát một cổng TCP trống trong dải từ 50000 đến 50100 và khởi tạo đối tượng ServerSocket mới. Sau đó, Server trả về mã trạng thái 227 kèm theo 6 số nguyên phân cách bằng dấu phẩy theo định dạng RFC 959:</w:t>
         <w:br/>
         <w:t>227 Entering Passive Mode (h1, h2, h3, h4, p1, p2).</w:t>
       </w:r>
@@ -10222,7 +10222,7 @@
         <w:rPr>
           <w:rtl w:val="0"/>
         </w:rPr>
-        <w:t>Gói thư viện mạng java.net của Java cung cấp lớp ServerSocket cho tiến trình máy chủ và lớp Socket cho tiến trình máy khách. Tại phía Server, đối tượng ServerSocket lắng nghe trên cổng 2121 trong một vòng lặp liên tục. Khi phương thức serverSocket.accept() nhận một kết nối mới, chương trình sẽ trả về một đối tượng Socket riêng cho kết nối đó.</w:t>
+        <w:t>Gói thư viện mạng java.net của Java cung cấp lớp ServerSocket cho tiến trình máy chủ và lớp Socket cho tiến trình máy khách. Phía Server, đối tượng ServerSocket lắng nghe trên cổng 2121 trong một vòng lặp liên tục. Khi phương thức serverSocket.accept() nhận một kết nối mới, chương trình sẽ trả về một đối tượng Socket riêng cho kết nối đó.</w:t>
         <w:br/>
         <w:t>Để việc xử lý của một Client không làm tắc nghẽn các Client khác, Server sử dụng mô hình Thread Pool thông qua ExecutorService (Executors.newCachedThreadPool()). Mỗi kết nối mới được đóng gói vào một đối tượng thực thi giao diện Runnable (ClientHandler) và được phân bổ cho một luồng công nhân (Worker Thread) chạy độc lập.</w:t>
       </w:r>
@@ -10261,9 +10261,9 @@
         <w:rPr>
           <w:rtl w:val="0"/>
         </w:rPr>
-        <w:t>Tốc độ truyền tệp qua mạng phụ thuộc lớn vào cách quản lý bộ đệm I/O. Nếu đọc và ghi từng byte đơn lẻ trực tiếp qua Socket (Unbuffered I/O), hệ điều hành phải thực hiện chuyển đổi ngữ cảnh (Context Switching) liên tục và tạo ra nhiều gói tin kích thước nhỏ gây lãng phí băng thông.</w:t>
+        <w:t>Tốc độ truyền tệp qua mạng phụ thuộc vào cách quản lý bộ đệm I/O. Nếu đọc và ghi từng byte đơn lẻ trực tiếp qua Socket (Unbuffered I/O), hệ điều hành phải thực hiện chuyển đổi ngữ cảnh (Context Switching) liên tục và tạo ra nhiều gói tin nhỏ gây lãng phí băng thông.</w:t>
         <w:br/>
-        <w:t>Để giải quyết vấn đề này, nhóm sử dụng kỹ thuật đọc ghi theo khối (Block Buffer) với kích thước bộ đệm là 8192 bytes (8 KB) thông qua hai lớp BufferedInputStream và BufferedOutputStream trong DataChannelHelper. Kích thước 8 KB phù hợp với cửa sổ trượt TCP (TCP Window) và kích thước phân đoạn tối đa (MTU/MSS) của mạng Ethernet, giúp giảm số lần gọi hệ thống (System Call) và tăng tốc độ truyền tải.</w:t>
+        <w:t>Để giải quyết vấn đề này, nhóm sử dụng kỹ thuật đọc ghi theo khối (Block Buffer) với kích thước bộ đệm là 8192 bytes (8 KB) thông qua hai lớp BufferedInputStream và BufferedOutputStream trong DataChannelHelper. Kích thước 8 KB phù hợp với cửa sổ trượt TCP (TCP Window) và kích thước phân đoạn tối đa (MTU/MSS) của mạng Ethernet, giúp giảm số lần gọi hệ thống và tăng tốc độ truyền tải.</w:t>
       </w:r>
     </w:p>
     <w:p>
@@ -10324,7 +10324,7 @@
         <w:rPr>
           <w:rtl w:val="0"/>
         </w:rPr>
-        <w:t>Trong các dịch vụ truyền tệp, lỗ hổng Directory Traversal (Path Traversal) xảy ra khi người dùng gửi kèm các chuỗi ký tự điều hướng như ../../../ hoặc ..\..\ vào tham số của lệnh CWD, RETR, STOR hoặc DELE. Nếu máy chủ không kiểm tra đường dẫn đích, người dùng có thể thoát khỏi thư mục được cấp phép để đọc, tải về hoặc ghi đè lên các tệp tin hệ thống của máy chủ như C:\Windows\System32 hay /etc/passwd.</w:t>
+        <w:t>Trong các dịch vụ truyền tệp, lỗ hổng Directory Traversal (Path Traversal) xảy ra khi người dùng gửi kèm các chuỗi ký tự điều hướng như ../../../ hoặc ..\..\ vào tham số của lệnh CWD, RETR, STOR hoặc DELE. Nếu máy chủ không kiểm tra đường dẫn đích, người dùng có thể thoát khỏi thư mục được cấp phép để đọc, tải về hoặc ghi đè các tệp tin hệ thống của máy chủ như C:\Windows\System32 hoặc /etc/passwd.</w:t>
       </w:r>
     </w:p>
     <w:p>
@@ -10367,7 +10367,7 @@
         <w:br/>
         <w:t>2. Trước khi thực thi lệnh thao tác tệp, Server phân giải đường dẫn chuẩn hóa của tệp đích qua phương thức targetFile.getCanonicalPath() (phương thức này sẽ tự động rút gọn mọi ký tự .. hoặc . trong đường dẫn).</w:t>
         <w:br/>
-        <w:t>3. Kiểm tra điều kiện canonicalTarget.startsWith(canonicalRoot). Nếu kết quả trả về false, Server hủy thao tác và gửi mã lỗi 550 Requested action not taken; file unavailable.</w:t>
+        <w:t>3. Kiểm tra điều kiện canonicalTarget.startsWith(canonicalRoot). Nếu kết quả trả về false, máy chủ hủy thao tác và gửi mã lỗi 550 Requested action not taken; file unavailable.</w:t>
       </w:r>
     </w:p>
     <w:p>
@@ -10442,7 +10442,7 @@
         <w:rPr>
           <w:rtl w:val="0"/>
         </w:rPr>
-        <w:t>Hệ thống FTP hai kênh được chia thành 3 phân hệ độc lập tương ứng với nhiệm vụ của 3 thành viên gồm phân hệ Server (Tiến), phân hệ Data Channel dùng chung (Trọng) và phân hệ Client (Vũ).</w:t>
+        <w:t>Hệ thống FTP hai kênh được chia thành 3 phần riêng biệt tương ứng với nhiệm vụ của 3 thành viên gồm phân hệ Server (Tiến), phân hệ Data Channel dùng chung (Trọng) và phân hệ Client (Vũ).</w:t>
       </w:r>
     </w:p>
     <w:p>
@@ -10757,7 +10757,7 @@
         </w:rPr>
         <w:t>• Lớp FtpClientController (client/FtpClientController.java) quản lý kết nối Socket của kênh điều khiển, gửi lệnh, đọc mã phản hồi, thiết lập kênh dữ liệu PASV và tự động gửi lệnh NOOP sau mỗi 60 giây nghỉ để giữ kết nối không bị ngắt.</w:t>
         <w:br/>
-        <w:t>• Lớp FileTransferTask (client/FileTransferTask.java) kế thừa từ lớp SwingWorker của Java. Lớp này đưa các tác vụ tải lên và tải xuống vào một luồng chạy ngầm (Background Thread) để giao diện người dùng không bị treo trong lúc truyền tệp dung lượng lớn, đồng thời cập nhật tỷ lệ phần trăm hoàn thành lên thanh JProgressBar.</w:t>
+        <w:t>• Lớp FileTransferTask (client/FileTransferTask.java) kế thừa từ lớp SwingWorker của Java. Lớp này đưa các tác vụ tải lên và tải xuống vào một luồng chạy ngầm (Background Thread) để giao diện người dùng không bị treo trong lúc truyền tệp dung lượng lớn, đồng thời cập nhật tỷ lệ phần trăm hoàn thành vào thanh JProgressBar.</w:t>
       </w:r>
     </w:p>
     <w:p>
@@ -11116,7 +11116,7 @@
         <w:rPr>
           <w:rtl w:val="0"/>
         </w:rPr>
-        <w:t>Hệ thống được chạy kiểm thử trên hai môi trường là mạng cục bộ trên cùng máy tính (Loopback Localhost) và kết nối giữa hai máy tính khác nhau qua mạng Wi-Fi LAN. Cấu hình phần cứng và phần mềm thử nghiệm được ghi nhận tại Bảng 4.1:</w:t>
+        <w:t>Hệ thống được chạy kiểm thử trên hai môi trường là mạng cục bộ trên cùng một máy tính (Loopback Localhost) và kết nối giữa hai máy tính khác nhau qua mạng Wi-Fi LAN. Cấu hình phần cứng và phần mềm thử nghiệm được ghi nhận tại Bảng 4.1:</w:t>
       </w:r>
     </w:p>
     <w:tbl>

</xml_diff>